<commit_message>
Fix(Section-parse): Update img tag to sfdt
</commit_message>
<xml_diff>
--- a/text_editor_client/src/assets/test_new_heading.docx
+++ b/text_editor_client/src/assets/test_new_heading.docx
@@ -15,17 +15,7 @@
     </w:p>
     <w:p>
       <w:pPr>
-        <w:rPr>
-          <w:lang w:val="vi-VN"/>
-        </w:rPr>
-      </w:pPr>
-      <w:r>
-        <w:t>www</w:t>
-      </w:r>
-    </w:p>
-    <w:p>
-      <w:pPr>
-        <w:pStyle w:val="Cu1"/>
+        <w:pStyle w:val="Mc1"/>
       </w:pPr>
       <w:r>
         <w:t xml:space="preserve">1.1 Xin </w:t>
@@ -37,9 +27,18 @@
     <w:p>
       <w:pPr>
         <w:pStyle w:val="Cu1"/>
+        <w:rPr>
+          <w:lang w:val="en-US"/>
+        </w:rPr>
       </w:pPr>
       <w:r>
         <w:t>Đsss</w:t>
+      </w:r>
+      <w:r>
+        <w:rPr>
+          <w:lang w:val="en-US"/>
+        </w:rPr>
+        <w:t>fffff ddddd eeeee</w:t>
       </w:r>
     </w:p>
     <w:sectPr>
@@ -971,7 +970,7 @@
   </w:style>
   <w:style w:type="paragraph" w:customStyle="1" w:styleId="Chng1">
     <w:name w:val="Chương 1"/>
-    <w:basedOn w:val="Normal"/>
+    <w:basedOn w:val="Heading1"/>
     <w:link w:val="Chng1Char"/>
     <w:qFormat/>
     <w:rsid w:val="000E3386"/>
@@ -980,7 +979,13 @@
     <w:name w:val="Chương 1 Char"/>
     <w:basedOn w:val="DefaultParagraphFont"/>
     <w:link w:val="Chng1"/>
-    <w:rsid w:val="000E3386"/>
+    <w:rsid w:val="00551644"/>
+    <w:rPr>
+      <w:rFonts w:asciiTheme="majorHAnsi" w:eastAsiaTheme="majorEastAsia" w:hAnsiTheme="majorHAnsi" w:cstheme="majorBidi"/>
+      <w:color w:val="0F4761" w:themeColor="accent1" w:themeShade="BF"/>
+      <w:sz w:val="40"/>
+      <w:szCs w:val="40"/>
+    </w:rPr>
   </w:style>
   <w:style w:type="paragraph" w:customStyle="1" w:styleId="Cu1">
     <w:name w:val="Câu 1"/>
@@ -990,6 +995,25 @@
     <w:rsid w:val="00BA12DD"/>
     <w:rPr>
       <w:lang w:val="vi-VN"/>
+    </w:rPr>
+  </w:style>
+  <w:style w:type="paragraph" w:customStyle="1" w:styleId="Mc1">
+    <w:name w:val="Mục 1"/>
+    <w:basedOn w:val="Heading2"/>
+    <w:link w:val="Mc1Char"/>
+    <w:qFormat/>
+    <w:rsid w:val="00551644"/>
+  </w:style>
+  <w:style w:type="character" w:customStyle="1" w:styleId="Mc1Char">
+    <w:name w:val="Mục 1 Char"/>
+    <w:basedOn w:val="Heading2Char"/>
+    <w:link w:val="Mc1"/>
+    <w:rsid w:val="00551644"/>
+    <w:rPr>
+      <w:rFonts w:asciiTheme="majorHAnsi" w:eastAsiaTheme="majorEastAsia" w:hAnsiTheme="majorHAnsi" w:cstheme="majorBidi"/>
+      <w:color w:val="0F4761" w:themeColor="accent1" w:themeShade="BF"/>
+      <w:sz w:val="32"/>
+      <w:szCs w:val="32"/>
     </w:rPr>
   </w:style>
 </w:styles>

</xml_diff>